<commit_message>
documentation updates for school
yuh
</commit_message>
<xml_diff>
--- a/modelis.docx
+++ b/modelis.docx
@@ -1,9 +1,27 @@
 
 <file path=word/document.xml><?xml version="1.0" encoding="utf-8"?>
-<w:document xmlns:wpc="http://schemas.microsoft.com/office/word/2010/wordprocessingCanvas" xmlns:cx="http://schemas.microsoft.com/office/drawing/2014/chartex" xmlns:cx1="http://schemas.microsoft.com/office/drawing/2015/9/8/chartex" xmlns:cx2="http://schemas.microsoft.com/office/drawing/2015/10/21/chartex" xmlns:cx3="http://schemas.microsoft.com/office/drawing/2016/5/9/chartex" xmlns:cx4="http://schemas.microsoft.com/office/drawing/2016/5/10/chartex" xmlns:cx5="http://schemas.microsoft.com/office/drawing/2016/5/11/chartex" xmlns:cx6="http://schemas.microsoft.com/office/drawing/2016/5/12/chartex" xmlns:cx7="http://schemas.microsoft.com/office/drawing/2016/5/13/chartex" xmlns:cx8="http://schemas.microsoft.com/office/drawing/2016/5/14/chartex" xmlns:mc="http://schemas.openxmlformats.org/markup-compatibility/2006" xmlns:aink="http://schemas.microsoft.com/office/drawing/2016/ink" xmlns:am3d="http://schemas.microsoft.com/office/drawing/2017/model3d" xmlns:o="urn:schemas-microsoft-com:office:office" xmlns:r="http://schemas.openxmlformats.org/officeDocument/2006/relationships" xmlns:m="http://schemas.openxmlformats.org/officeDocument/2006/math" xmlns:v="urn:schemas-microsoft-com:vml" xmlns:wp14="http://schemas.microsoft.com/office/word/2010/wordprocessingDrawing" xmlns:wp="http://schemas.openxmlformats.org/drawingml/2006/wordprocessingDrawing" xmlns:w10="urn:schemas-microsoft-com:office:word" xmlns:w="http://schemas.openxmlformats.org/wordprocessingml/2006/main" xmlns:w14="http://schemas.microsoft.com/office/word/2010/wordml" xmlns:w15="http://schemas.microsoft.com/office/word/2012/wordml" xmlns:w16cex="http://schemas.microsoft.com/office/word/2018/wordml/cex" xmlns:w16cid="http://schemas.microsoft.com/office/word/2016/wordml/cid" xmlns:w16="http://schemas.microsoft.com/office/word/2018/wordml" xmlns:w16sdtdh="http://schemas.microsoft.com/office/word/2020/wordml/sdtdatahash" xmlns:w16se="http://schemas.microsoft.com/office/word/2015/wordml/symex" xmlns:wpg="http://schemas.microsoft.com/office/word/2010/wordprocessingGroup" xmlns:wpi="http://schemas.microsoft.com/office/word/2010/wordprocessingInk" xmlns:wne="http://schemas.microsoft.com/office/word/2006/wordml" xmlns:wps="http://schemas.microsoft.com/office/word/2010/wordprocessingShape" mc:Ignorable="w14 w15 w16se w16cid w16 w16cex w16sdtdh wp14">
+<w:document xmlns:wpc="http://schemas.microsoft.com/office/word/2010/wordprocessingCanvas" xmlns:cx="http://schemas.microsoft.com/office/drawing/2014/chartex" xmlns:mc="http://schemas.openxmlformats.org/markup-compatibility/2006" xmlns:o="urn:schemas-microsoft-com:office:office" xmlns:r="http://schemas.openxmlformats.org/officeDocument/2006/relationships" xmlns:m="http://schemas.openxmlformats.org/officeDocument/2006/math" xmlns:v="urn:schemas-microsoft-com:vml" xmlns:wp14="http://schemas.microsoft.com/office/word/2010/wordprocessingDrawing" xmlns:wp="http://schemas.openxmlformats.org/drawingml/2006/wordprocessingDrawing" xmlns:w10="urn:schemas-microsoft-com:office:word" xmlns:w="http://schemas.openxmlformats.org/wordprocessingml/2006/main" xmlns:w14="http://schemas.microsoft.com/office/word/2010/wordml" xmlns:w15="http://schemas.microsoft.com/office/word/2012/wordml" xmlns:w16se="http://schemas.microsoft.com/office/word/2015/wordml/symex" xmlns:wpg="http://schemas.microsoft.com/office/word/2010/wordprocessingGroup" xmlns:wpi="http://schemas.microsoft.com/office/word/2010/wordprocessingInk" xmlns:wne="http://schemas.microsoft.com/office/word/2006/wordml" xmlns:wps="http://schemas.microsoft.com/office/word/2010/wordprocessingShape" mc:Ignorable="w14 w15 w16se wp14">
   <w:body>
     <w:p>
-      <w:r>
+      <w:pPr>
+        <w:jc w:val="center"/>
+        <w:rPr>
+          <w:sz w:val="40"/>
+        </w:rPr>
+      </w:pPr>
+      <w:r>
+        <w:rPr>
+          <w:sz w:val="40"/>
+        </w:rPr>
+        <w:t>COOLSPOT</w:t>
+      </w:r>
+    </w:p>
+    <w:p>
+      <w:r>
+        <w:rPr>
+          <w:noProof/>
+          <w:lang w:eastAsia="lv-LV"/>
+        </w:rPr>
         <w:drawing>
           <wp:inline distT="0" distB="0" distL="0" distR="0" wp14:anchorId="5D17BAF7" wp14:editId="726C75B6">
             <wp:extent cx="5210902" cy="4601217"/>
@@ -20,7 +38,7 @@
                     <pic:cNvPicPr/>
                   </pic:nvPicPr>
                   <pic:blipFill>
-                    <a:blip r:embed="rId5"/>
+                    <a:blip r:embed="rId8"/>
                     <a:stretch>
                       <a:fillRect/>
                     </a:stretch>
@@ -49,27 +67,9 @@
           <w:numId w:val="1"/>
         </w:numPr>
       </w:pPr>
-      <w:proofErr w:type="spellStart"/>
-      <w:r>
-        <w:t>Admins</w:t>
-      </w:r>
-      <w:proofErr w:type="spellEnd"/>
-      <w:r>
-        <w:t xml:space="preserve"> var </w:t>
-      </w:r>
-      <w:proofErr w:type="spellStart"/>
-      <w:r>
-        <w:t>rediget</w:t>
-      </w:r>
-      <w:proofErr w:type="spellEnd"/>
-      <w:r>
-        <w:t xml:space="preserve"> </w:t>
-      </w:r>
-      <w:proofErr w:type="spellStart"/>
-      <w:r>
-        <w:t>userus</w:t>
-      </w:r>
-      <w:proofErr w:type="spellEnd"/>
+      <w:r>
+        <w:t>Admins var rediget userus</w:t>
+      </w:r>
     </w:p>
     <w:p>
       <w:pPr>
@@ -79,27 +79,15 @@
           <w:numId w:val="1"/>
         </w:numPr>
       </w:pPr>
-      <w:proofErr w:type="spellStart"/>
-      <w:r>
-        <w:t>Admins</w:t>
-      </w:r>
-      <w:proofErr w:type="spellEnd"/>
-      <w:r>
-        <w:t xml:space="preserve"> var </w:t>
-      </w:r>
-      <w:proofErr w:type="spellStart"/>
+      <w:r>
+        <w:t xml:space="preserve">Admins var </w:t>
+      </w:r>
       <w:r>
         <w:t>rediget</w:t>
       </w:r>
-      <w:proofErr w:type="spellEnd"/>
-      <w:r>
-        <w:t xml:space="preserve"> postus un </w:t>
-      </w:r>
-      <w:proofErr w:type="spellStart"/>
-      <w:r>
-        <w:t>komentarus</w:t>
-      </w:r>
-      <w:proofErr w:type="spellEnd"/>
+      <w:r>
+        <w:t xml:space="preserve"> postus un komentarus</w:t>
+      </w:r>
     </w:p>
     <w:p>
       <w:pPr>
@@ -109,21 +97,8 @@
           <w:numId w:val="1"/>
         </w:numPr>
       </w:pPr>
-      <w:proofErr w:type="spellStart"/>
-      <w:r>
-        <w:t>Guests</w:t>
-      </w:r>
-      <w:proofErr w:type="spellEnd"/>
-      <w:r>
-        <w:t xml:space="preserve"> var </w:t>
-      </w:r>
-      <w:proofErr w:type="spellStart"/>
-      <w:r>
-        <w:t>redzet</w:t>
-      </w:r>
-      <w:proofErr w:type="spellEnd"/>
-      <w:r>
-        <w:t xml:space="preserve"> postus</w:t>
+      <w:r>
+        <w:t>Guests var redzet postus</w:t>
       </w:r>
     </w:p>
     <w:p>
@@ -134,27 +109,9 @@
           <w:numId w:val="1"/>
         </w:numPr>
       </w:pPr>
-      <w:proofErr w:type="spellStart"/>
-      <w:r>
-        <w:t>Guests</w:t>
-      </w:r>
-      <w:proofErr w:type="spellEnd"/>
-      <w:r>
-        <w:t xml:space="preserve"> var </w:t>
-      </w:r>
-      <w:proofErr w:type="spellStart"/>
-      <w:r>
-        <w:t>redzet</w:t>
-      </w:r>
-      <w:proofErr w:type="spellEnd"/>
-      <w:r>
-        <w:t xml:space="preserve"> </w:t>
-      </w:r>
-      <w:proofErr w:type="spellStart"/>
-      <w:r>
-        <w:t>komentarus</w:t>
-      </w:r>
-      <w:proofErr w:type="spellEnd"/>
+      <w:r>
+        <w:t>Guests var redzet komentarus</w:t>
+      </w:r>
     </w:p>
     <w:p>
       <w:pPr>
@@ -165,37 +122,8 @@
         </w:numPr>
       </w:pPr>
       <w:r>
-        <w:t xml:space="preserve">User var </w:t>
-      </w:r>
-      <w:proofErr w:type="spellStart"/>
-      <w:r>
-        <w:t>rakstit</w:t>
-      </w:r>
-      <w:proofErr w:type="spellEnd"/>
-      <w:r>
-        <w:t xml:space="preserve">, </w:t>
-      </w:r>
-      <w:proofErr w:type="spellStart"/>
-      <w:r>
-        <w:t>redzet</w:t>
-      </w:r>
-      <w:proofErr w:type="spellEnd"/>
-      <w:r>
-        <w:t xml:space="preserve"> un </w:t>
-      </w:r>
-      <w:proofErr w:type="spellStart"/>
-      <w:r>
-        <w:t>dzest</w:t>
-      </w:r>
-      <w:proofErr w:type="spellEnd"/>
-      <w:r>
-        <w:t xml:space="preserve"> </w:t>
-      </w:r>
-      <w:proofErr w:type="spellStart"/>
-      <w:r>
-        <w:t>komentarus</w:t>
-      </w:r>
-      <w:proofErr w:type="spellEnd"/>
+        <w:t>User var rakstit, redzet un dzest komentarus</w:t>
+      </w:r>
     </w:p>
     <w:p>
       <w:pPr>
@@ -205,21 +133,8 @@
           <w:numId w:val="1"/>
         </w:numPr>
       </w:pPr>
-      <w:proofErr w:type="spellStart"/>
-      <w:r>
-        <w:t>Guest</w:t>
-      </w:r>
-      <w:proofErr w:type="spellEnd"/>
-      <w:r>
-        <w:t xml:space="preserve"> var </w:t>
-      </w:r>
-      <w:proofErr w:type="spellStart"/>
-      <w:r>
-        <w:t>redzet</w:t>
-      </w:r>
-      <w:proofErr w:type="spellEnd"/>
-      <w:r>
-        <w:t xml:space="preserve"> mapi</w:t>
+      <w:r>
+        <w:t>Guest var redzet mapi</w:t>
       </w:r>
     </w:p>
     <w:p>
@@ -231,15 +146,7 @@
         </w:numPr>
       </w:pPr>
       <w:r>
-        <w:t xml:space="preserve">User var </w:t>
-      </w:r>
-      <w:proofErr w:type="spellStart"/>
-      <w:r>
-        <w:t>redzet</w:t>
-      </w:r>
-      <w:proofErr w:type="spellEnd"/>
-      <w:r>
-        <w:t xml:space="preserve"> mapi</w:t>
+        <w:t>User var redzet mapi</w:t>
       </w:r>
     </w:p>
     <w:p>
@@ -251,23 +158,7 @@
         </w:numPr>
       </w:pPr>
       <w:r>
-        <w:t xml:space="preserve">User var pievienot, </w:t>
-      </w:r>
-      <w:proofErr w:type="spellStart"/>
-      <w:r>
-        <w:t>dzest</w:t>
-      </w:r>
-      <w:proofErr w:type="spellEnd"/>
-      <w:r>
-        <w:t xml:space="preserve"> postu (</w:t>
-      </w:r>
-      <w:proofErr w:type="spellStart"/>
-      <w:r>
-        <w:t>spotu</w:t>
-      </w:r>
-      <w:proofErr w:type="spellEnd"/>
-      <w:r>
-        <w:t>)</w:t>
+        <w:t>User var pievienot, dzest postu (spotu)</w:t>
       </w:r>
     </w:p>
     <w:p>
@@ -278,21 +169,8 @@
           <w:numId w:val="1"/>
         </w:numPr>
       </w:pPr>
-      <w:proofErr w:type="spellStart"/>
-      <w:r>
-        <w:t>Commenti</w:t>
-      </w:r>
-      <w:proofErr w:type="spellEnd"/>
-      <w:r>
-        <w:t xml:space="preserve"> ir pielikti pie </w:t>
-      </w:r>
-      <w:proofErr w:type="spellStart"/>
-      <w:r>
-        <w:t>konkreta</w:t>
-      </w:r>
-      <w:proofErr w:type="spellEnd"/>
-      <w:r>
-        <w:t xml:space="preserve"> posta</w:t>
+      <w:r>
+        <w:t>Commenti ir pielikti pie konkreta posta</w:t>
       </w:r>
     </w:p>
     <w:p>
@@ -304,25 +182,16 @@
         </w:numPr>
       </w:pPr>
       <w:r>
-        <w:t xml:space="preserve">Mape </w:t>
-      </w:r>
-      <w:proofErr w:type="spellStart"/>
-      <w:r>
-        <w:t>attelo</w:t>
-      </w:r>
-      <w:proofErr w:type="spellEnd"/>
-      <w:r>
-        <w:t xml:space="preserve"> postus (</w:t>
-      </w:r>
-      <w:proofErr w:type="spellStart"/>
-      <w:r>
-        <w:t>spotus</w:t>
-      </w:r>
-      <w:proofErr w:type="spellEnd"/>
-      <w:r>
-        <w:t xml:space="preserve">) </w:t>
-      </w:r>
-    </w:p>
+        <w:t xml:space="preserve">Mape attelo postus (spotus) </w:t>
+      </w:r>
+    </w:p>
+    <w:p/>
+    <w:p/>
+    <w:p/>
+    <w:p/>
+    <w:p/>
+    <w:p/>
+    <w:p/>
     <w:p/>
     <w:p>
       <w:r>
@@ -356,19 +225,9 @@
             <w:tcW w:w="898" w:type="dxa"/>
           </w:tcPr>
           <w:p>
-            <w:proofErr w:type="spellStart"/>
-            <w:r>
-              <w:t>Is</w:t>
-            </w:r>
-            <w:proofErr w:type="spellEnd"/>
-            <w:r>
-              <w:t xml:space="preserve"> </w:t>
-            </w:r>
-            <w:proofErr w:type="spellStart"/>
-            <w:r>
-              <w:t>admin</w:t>
-            </w:r>
-            <w:proofErr w:type="spellEnd"/>
+            <w:r>
+              <w:t>Is admin</w:t>
+            </w:r>
           </w:p>
         </w:tc>
         <w:tc>
@@ -376,11 +235,9 @@
             <w:tcW w:w="642" w:type="dxa"/>
           </w:tcPr>
           <w:p>
-            <w:proofErr w:type="spellStart"/>
             <w:r>
               <w:t>id</w:t>
             </w:r>
-            <w:proofErr w:type="spellEnd"/>
           </w:p>
         </w:tc>
         <w:tc>
@@ -388,11 +245,9 @@
             <w:tcW w:w="1141" w:type="dxa"/>
           </w:tcPr>
           <w:p>
-            <w:proofErr w:type="spellStart"/>
             <w:r>
               <w:t>nickname</w:t>
             </w:r>
-            <w:proofErr w:type="spellEnd"/>
           </w:p>
         </w:tc>
         <w:tc>
@@ -401,13 +256,8 @@
           </w:tcPr>
           <w:p>
             <w:r>
-              <w:t>e-</w:t>
-            </w:r>
-            <w:proofErr w:type="spellStart"/>
-            <w:r>
-              <w:t>mail</w:t>
-            </w:r>
-            <w:proofErr w:type="spellEnd"/>
+              <w:t>e-mail</w:t>
+            </w:r>
           </w:p>
         </w:tc>
         <w:tc>
@@ -415,11 +265,9 @@
             <w:tcW w:w="1134" w:type="dxa"/>
           </w:tcPr>
           <w:p>
-            <w:proofErr w:type="spellStart"/>
             <w:r>
               <w:t>Password</w:t>
             </w:r>
-            <w:proofErr w:type="spellEnd"/>
           </w:p>
         </w:tc>
         <w:tc>
@@ -427,19 +275,9 @@
             <w:tcW w:w="3755" w:type="dxa"/>
           </w:tcPr>
           <w:p>
-            <w:proofErr w:type="spellStart"/>
-            <w:r>
-              <w:t>Profile</w:t>
-            </w:r>
-            <w:proofErr w:type="spellEnd"/>
-            <w:r>
-              <w:t xml:space="preserve"> </w:t>
-            </w:r>
-            <w:proofErr w:type="spellStart"/>
-            <w:r>
-              <w:t>pic</w:t>
-            </w:r>
-            <w:proofErr w:type="spellEnd"/>
+            <w:r>
+              <w:t>Profile pic</w:t>
+            </w:r>
           </w:p>
         </w:tc>
       </w:tr>
@@ -449,11 +287,9 @@
             <w:tcW w:w="916" w:type="dxa"/>
           </w:tcPr>
           <w:p>
-            <w:proofErr w:type="spellStart"/>
             <w:r>
               <w:t>Admin</w:t>
             </w:r>
-            <w:proofErr w:type="spellEnd"/>
           </w:p>
         </w:tc>
         <w:tc>
@@ -461,21 +297,8 @@
             <w:tcW w:w="898" w:type="dxa"/>
           </w:tcPr>
           <w:p>
-            <w:proofErr w:type="spellStart"/>
-            <w:r>
-              <w:t>True</w:t>
-            </w:r>
-            <w:proofErr w:type="spellEnd"/>
-            <w:r>
-              <w:t xml:space="preserve"> (</w:t>
-            </w:r>
-            <w:proofErr w:type="spellStart"/>
-            <w:r>
-              <w:t>bool</w:t>
-            </w:r>
-            <w:proofErr w:type="spellEnd"/>
-            <w:r>
-              <w:t>)</w:t>
+            <w:r>
+              <w:t>True (bool)</w:t>
             </w:r>
           </w:p>
         </w:tc>
@@ -494,11 +317,9 @@
             <w:tcW w:w="1141" w:type="dxa"/>
           </w:tcPr>
           <w:p>
-            <w:proofErr w:type="spellStart"/>
             <w:r>
               <w:t>String</w:t>
             </w:r>
-            <w:proofErr w:type="spellEnd"/>
           </w:p>
         </w:tc>
         <w:tc>
@@ -506,11 +327,9 @@
             <w:tcW w:w="865" w:type="dxa"/>
           </w:tcPr>
           <w:p>
-            <w:proofErr w:type="spellStart"/>
             <w:r>
               <w:t>String</w:t>
             </w:r>
-            <w:proofErr w:type="spellEnd"/>
           </w:p>
         </w:tc>
         <w:tc>
@@ -518,11 +337,9 @@
             <w:tcW w:w="1134" w:type="dxa"/>
           </w:tcPr>
           <w:p>
-            <w:proofErr w:type="spellStart"/>
             <w:r>
               <w:t>String</w:t>
             </w:r>
-            <w:proofErr w:type="spellEnd"/>
           </w:p>
         </w:tc>
         <w:tc>
@@ -530,11 +347,9 @@
             <w:tcW w:w="3755" w:type="dxa"/>
           </w:tcPr>
           <w:p>
-            <w:proofErr w:type="spellStart"/>
             <w:r>
               <w:t>Bin</w:t>
             </w:r>
-            <w:proofErr w:type="spellEnd"/>
           </w:p>
         </w:tc>
       </w:tr>
@@ -554,21 +369,8 @@
             <w:tcW w:w="898" w:type="dxa"/>
           </w:tcPr>
           <w:p>
-            <w:proofErr w:type="spellStart"/>
-            <w:r>
-              <w:t>False</w:t>
-            </w:r>
-            <w:proofErr w:type="spellEnd"/>
-            <w:r>
-              <w:t xml:space="preserve"> (</w:t>
-            </w:r>
-            <w:proofErr w:type="spellStart"/>
-            <w:r>
-              <w:t>bool</w:t>
-            </w:r>
-            <w:proofErr w:type="spellEnd"/>
-            <w:r>
-              <w:t>)</w:t>
+            <w:r>
+              <w:t>False (bool)</w:t>
             </w:r>
           </w:p>
         </w:tc>
@@ -587,11 +389,9 @@
             <w:tcW w:w="1141" w:type="dxa"/>
           </w:tcPr>
           <w:p>
-            <w:proofErr w:type="spellStart"/>
             <w:r>
               <w:t>String</w:t>
             </w:r>
-            <w:proofErr w:type="spellEnd"/>
           </w:p>
         </w:tc>
         <w:tc>
@@ -599,11 +399,9 @@
             <w:tcW w:w="865" w:type="dxa"/>
           </w:tcPr>
           <w:p>
-            <w:proofErr w:type="spellStart"/>
             <w:r>
               <w:t>String</w:t>
             </w:r>
-            <w:proofErr w:type="spellEnd"/>
           </w:p>
         </w:tc>
         <w:tc>
@@ -611,11 +409,9 @@
             <w:tcW w:w="1134" w:type="dxa"/>
           </w:tcPr>
           <w:p>
-            <w:proofErr w:type="spellStart"/>
             <w:r>
               <w:t>String</w:t>
             </w:r>
-            <w:proofErr w:type="spellEnd"/>
           </w:p>
         </w:tc>
         <w:tc>
@@ -623,29 +419,17 @@
             <w:tcW w:w="3755" w:type="dxa"/>
           </w:tcPr>
           <w:p>
-            <w:proofErr w:type="spellStart"/>
             <w:r>
               <w:t>Bin</w:t>
             </w:r>
-            <w:proofErr w:type="spellEnd"/>
           </w:p>
         </w:tc>
       </w:tr>
     </w:tbl>
     <w:p/>
-    <w:p/>
-    <w:p>
-      <w:r>
-        <w:lastRenderedPageBreak/>
-        <w:t>Post (</w:t>
-      </w:r>
-      <w:proofErr w:type="spellStart"/>
-      <w:r>
-        <w:t>spot</w:t>
-      </w:r>
-      <w:proofErr w:type="spellEnd"/>
-      <w:r>
-        <w:t>)</w:t>
+    <w:p>
+      <w:r>
+        <w:t>Post (spot)</w:t>
       </w:r>
     </w:p>
     <w:tbl>
@@ -669,11 +453,9 @@
             <w:tcW w:w="1044" w:type="dxa"/>
           </w:tcPr>
           <w:p>
-            <w:proofErr w:type="spellStart"/>
             <w:r>
               <w:t>Id</w:t>
             </w:r>
-            <w:proofErr w:type="spellEnd"/>
           </w:p>
         </w:tc>
         <w:tc>
@@ -681,11 +463,9 @@
             <w:tcW w:w="1192" w:type="dxa"/>
           </w:tcPr>
           <w:p>
-            <w:proofErr w:type="spellStart"/>
             <w:r>
               <w:t>Name</w:t>
             </w:r>
-            <w:proofErr w:type="spellEnd"/>
           </w:p>
         </w:tc>
         <w:tc>
@@ -693,11 +473,9 @@
             <w:tcW w:w="1443" w:type="dxa"/>
           </w:tcPr>
           <w:p>
-            <w:proofErr w:type="spellStart"/>
             <w:r>
               <w:t>Description</w:t>
             </w:r>
-            <w:proofErr w:type="spellEnd"/>
           </w:p>
         </w:tc>
         <w:tc>
@@ -705,11 +483,9 @@
             <w:tcW w:w="1475" w:type="dxa"/>
           </w:tcPr>
           <w:p>
-            <w:proofErr w:type="spellStart"/>
             <w:r>
               <w:t>Geolocation</w:t>
             </w:r>
-            <w:proofErr w:type="spellEnd"/>
           </w:p>
         </w:tc>
         <w:tc>
@@ -718,13 +494,8 @@
           </w:tcPr>
           <w:p>
             <w:r>
-              <w:t xml:space="preserve">User </w:t>
-            </w:r>
-            <w:proofErr w:type="spellStart"/>
-            <w:r>
-              <w:t>id</w:t>
-            </w:r>
-            <w:proofErr w:type="spellEnd"/>
+              <w:t>User id</w:t>
+            </w:r>
           </w:p>
         </w:tc>
         <w:tc>
@@ -742,11 +513,9 @@
             <w:tcW w:w="921" w:type="dxa"/>
           </w:tcPr>
           <w:p>
-            <w:proofErr w:type="spellStart"/>
             <w:r>
               <w:t>Time</w:t>
             </w:r>
-            <w:proofErr w:type="spellEnd"/>
           </w:p>
         </w:tc>
       </w:tr>
@@ -766,11 +535,9 @@
             <w:tcW w:w="1192" w:type="dxa"/>
           </w:tcPr>
           <w:p>
-            <w:proofErr w:type="spellStart"/>
             <w:r>
               <w:t>String</w:t>
             </w:r>
-            <w:proofErr w:type="spellEnd"/>
           </w:p>
         </w:tc>
         <w:tc>
@@ -778,11 +545,9 @@
             <w:tcW w:w="1443" w:type="dxa"/>
           </w:tcPr>
           <w:p>
-            <w:proofErr w:type="spellStart"/>
             <w:r>
               <w:t>String</w:t>
             </w:r>
-            <w:proofErr w:type="spellEnd"/>
           </w:p>
         </w:tc>
         <w:tc>
@@ -790,11 +555,9 @@
             <w:tcW w:w="1475" w:type="dxa"/>
           </w:tcPr>
           <w:p>
-            <w:proofErr w:type="spellStart"/>
             <w:r>
               <w:t>String</w:t>
             </w:r>
-            <w:proofErr w:type="spellEnd"/>
           </w:p>
         </w:tc>
         <w:tc>
@@ -802,11 +565,9 @@
             <w:tcW w:w="1131" w:type="dxa"/>
           </w:tcPr>
           <w:p>
-            <w:proofErr w:type="spellStart"/>
             <w:r>
               <w:t>int</w:t>
             </w:r>
-            <w:proofErr w:type="spellEnd"/>
           </w:p>
         </w:tc>
         <w:tc>
@@ -814,11 +575,9 @@
             <w:tcW w:w="1090" w:type="dxa"/>
           </w:tcPr>
           <w:p>
-            <w:proofErr w:type="spellStart"/>
             <w:r>
               <w:t>int</w:t>
             </w:r>
-            <w:proofErr w:type="spellEnd"/>
           </w:p>
         </w:tc>
         <w:tc>
@@ -826,22 +585,18 @@
             <w:tcW w:w="921" w:type="dxa"/>
           </w:tcPr>
           <w:p>
-            <w:proofErr w:type="spellStart"/>
             <w:r>
               <w:t>Datetime</w:t>
             </w:r>
-            <w:proofErr w:type="spellEnd"/>
           </w:p>
         </w:tc>
       </w:tr>
     </w:tbl>
     <w:p/>
     <w:p>
-      <w:proofErr w:type="spellStart"/>
       <w:r>
         <w:t>Comment</w:t>
       </w:r>
-      <w:proofErr w:type="spellEnd"/>
     </w:p>
     <w:tbl>
       <w:tblPr>
@@ -863,11 +618,9 @@
             <w:tcW w:w="1341" w:type="dxa"/>
           </w:tcPr>
           <w:p>
-            <w:proofErr w:type="spellStart"/>
             <w:r>
               <w:t>Id</w:t>
             </w:r>
-            <w:proofErr w:type="spellEnd"/>
           </w:p>
         </w:tc>
         <w:tc>
@@ -876,13 +629,8 @@
           </w:tcPr>
           <w:p>
             <w:r>
-              <w:t xml:space="preserve">Post </w:t>
-            </w:r>
-            <w:proofErr w:type="spellStart"/>
-            <w:r>
-              <w:t>id</w:t>
-            </w:r>
-            <w:proofErr w:type="spellEnd"/>
+              <w:t>Post id</w:t>
+            </w:r>
           </w:p>
         </w:tc>
         <w:tc>
@@ -891,13 +639,8 @@
           </w:tcPr>
           <w:p>
             <w:r>
-              <w:t xml:space="preserve">User </w:t>
-            </w:r>
-            <w:proofErr w:type="spellStart"/>
-            <w:r>
-              <w:t>id</w:t>
-            </w:r>
-            <w:proofErr w:type="spellEnd"/>
+              <w:t>User id</w:t>
+            </w:r>
           </w:p>
         </w:tc>
         <w:tc>
@@ -905,11 +648,9 @@
             <w:tcW w:w="1414" w:type="dxa"/>
           </w:tcPr>
           <w:p>
-            <w:proofErr w:type="spellStart"/>
             <w:r>
               <w:t>Text</w:t>
             </w:r>
-            <w:proofErr w:type="spellEnd"/>
           </w:p>
         </w:tc>
         <w:tc>
@@ -917,13 +658,8 @@
             <w:tcW w:w="1498" w:type="dxa"/>
           </w:tcPr>
           <w:p>
-            <w:proofErr w:type="spellStart"/>
-            <w:r>
-              <w:t>Time</w:t>
-            </w:r>
-            <w:proofErr w:type="spellEnd"/>
-            <w:r>
-              <w:t xml:space="preserve"> </w:t>
+            <w:r>
+              <w:t xml:space="preserve">Time </w:t>
             </w:r>
           </w:p>
         </w:tc>
@@ -967,11 +703,9 @@
             <w:tcW w:w="1386" w:type="dxa"/>
           </w:tcPr>
           <w:p>
-            <w:proofErr w:type="spellStart"/>
             <w:r>
               <w:t>Id</w:t>
             </w:r>
-            <w:proofErr w:type="spellEnd"/>
           </w:p>
         </w:tc>
         <w:tc>
@@ -979,11 +713,9 @@
             <w:tcW w:w="1414" w:type="dxa"/>
           </w:tcPr>
           <w:p>
-            <w:proofErr w:type="spellStart"/>
             <w:r>
               <w:t>String</w:t>
             </w:r>
-            <w:proofErr w:type="spellEnd"/>
           </w:p>
         </w:tc>
         <w:tc>
@@ -991,11 +723,9 @@
             <w:tcW w:w="1498" w:type="dxa"/>
           </w:tcPr>
           <w:p>
-            <w:proofErr w:type="spellStart"/>
             <w:r>
               <w:t>Datetime</w:t>
             </w:r>
-            <w:proofErr w:type="spellEnd"/>
           </w:p>
         </w:tc>
         <w:tc>
@@ -1033,11 +763,9 @@
             <w:tcW w:w="1659" w:type="dxa"/>
           </w:tcPr>
           <w:p>
-            <w:proofErr w:type="spellStart"/>
             <w:r>
               <w:t>Id</w:t>
             </w:r>
-            <w:proofErr w:type="spellEnd"/>
           </w:p>
         </w:tc>
         <w:tc>
@@ -1046,13 +774,8 @@
           </w:tcPr>
           <w:p>
             <w:r>
-              <w:t xml:space="preserve">Post </w:t>
-            </w:r>
-            <w:proofErr w:type="spellStart"/>
-            <w:r>
-              <w:t>id</w:t>
-            </w:r>
-            <w:proofErr w:type="spellEnd"/>
+              <w:t>Post id</w:t>
+            </w:r>
           </w:p>
         </w:tc>
         <w:tc>
@@ -1092,16 +815,699 @@
             <w:tcW w:w="1659" w:type="dxa"/>
           </w:tcPr>
           <w:p>
-            <w:proofErr w:type="spellStart"/>
             <w:r>
               <w:t>Bin</w:t>
             </w:r>
-            <w:proofErr w:type="spellEnd"/>
           </w:p>
         </w:tc>
       </w:tr>
     </w:tbl>
     <w:p/>
+    <w:p>
+      <w:r>
+        <w:t>Likes</w:t>
+      </w:r>
+    </w:p>
+    <w:tbl>
+      <w:tblPr>
+        <w:tblStyle w:val="TableGrid"/>
+        <w:tblW w:w="0" w:type="auto"/>
+        <w:tblLook w:val="04A0" w:firstRow="1" w:lastRow="0" w:firstColumn="1" w:lastColumn="0" w:noHBand="0" w:noVBand="1"/>
+      </w:tblPr>
+      <w:tblGrid>
+        <w:gridCol w:w="1659"/>
+        <w:gridCol w:w="1659"/>
+        <w:gridCol w:w="1659"/>
+      </w:tblGrid>
+      <w:tr>
+        <w:tc>
+          <w:tcPr>
+            <w:tcW w:w="1659" w:type="dxa"/>
+          </w:tcPr>
+          <w:p>
+            <w:r>
+              <w:t>ID</w:t>
+            </w:r>
+          </w:p>
+        </w:tc>
+        <w:tc>
+          <w:tcPr>
+            <w:tcW w:w="1659" w:type="dxa"/>
+          </w:tcPr>
+          <w:p>
+            <w:r>
+              <w:t>UserID</w:t>
+            </w:r>
+          </w:p>
+        </w:tc>
+        <w:tc>
+          <w:tcPr>
+            <w:tcW w:w="1659" w:type="dxa"/>
+          </w:tcPr>
+          <w:p>
+            <w:r>
+              <w:t>PostID</w:t>
+            </w:r>
+          </w:p>
+        </w:tc>
+      </w:tr>
+      <w:tr>
+        <w:tc>
+          <w:tcPr>
+            <w:tcW w:w="1659" w:type="dxa"/>
+          </w:tcPr>
+          <w:p>
+            <w:r>
+              <w:t>int</w:t>
+            </w:r>
+          </w:p>
+        </w:tc>
+        <w:tc>
+          <w:tcPr>
+            <w:tcW w:w="1659" w:type="dxa"/>
+          </w:tcPr>
+          <w:p>
+            <w:r>
+              <w:t>int</w:t>
+            </w:r>
+          </w:p>
+        </w:tc>
+        <w:tc>
+          <w:tcPr>
+            <w:tcW w:w="1659" w:type="dxa"/>
+          </w:tcPr>
+          <w:p>
+            <w:r>
+              <w:t>int</w:t>
+            </w:r>
+          </w:p>
+        </w:tc>
+      </w:tr>
+    </w:tbl>
+    <w:p/>
+    <w:p>
+      <w:r>
+        <w:t>Comment</w:t>
+      </w:r>
+    </w:p>
+    <w:tbl>
+      <w:tblPr>
+        <w:tblStyle w:val="TableGrid"/>
+        <w:tblW w:w="0" w:type="auto"/>
+        <w:tblLook w:val="04A0" w:firstRow="1" w:lastRow="0" w:firstColumn="1" w:lastColumn="0" w:noHBand="0" w:noVBand="1"/>
+      </w:tblPr>
+      <w:tblGrid>
+        <w:gridCol w:w="1659"/>
+        <w:gridCol w:w="1659"/>
+        <w:gridCol w:w="1659"/>
+      </w:tblGrid>
+      <w:tr>
+        <w:tc>
+          <w:tcPr>
+            <w:tcW w:w="1659" w:type="dxa"/>
+          </w:tcPr>
+          <w:p>
+            <w:r>
+              <w:t>ID</w:t>
+            </w:r>
+          </w:p>
+        </w:tc>
+        <w:tc>
+          <w:tcPr>
+            <w:tcW w:w="1659" w:type="dxa"/>
+          </w:tcPr>
+          <w:p>
+            <w:r>
+              <w:t>UserID</w:t>
+            </w:r>
+          </w:p>
+        </w:tc>
+        <w:tc>
+          <w:tcPr>
+            <w:tcW w:w="1659" w:type="dxa"/>
+          </w:tcPr>
+          <w:p>
+            <w:r>
+              <w:t>Comment</w:t>
+            </w:r>
+            <w:r>
+              <w:t>ID</w:t>
+            </w:r>
+          </w:p>
+        </w:tc>
+      </w:tr>
+      <w:tr>
+        <w:tc>
+          <w:tcPr>
+            <w:tcW w:w="1659" w:type="dxa"/>
+          </w:tcPr>
+          <w:p>
+            <w:r>
+              <w:t>int</w:t>
+            </w:r>
+          </w:p>
+        </w:tc>
+        <w:tc>
+          <w:tcPr>
+            <w:tcW w:w="1659" w:type="dxa"/>
+          </w:tcPr>
+          <w:p>
+            <w:r>
+              <w:t>int</w:t>
+            </w:r>
+          </w:p>
+        </w:tc>
+        <w:tc>
+          <w:tcPr>
+            <w:tcW w:w="1659" w:type="dxa"/>
+          </w:tcPr>
+          <w:p>
+            <w:r>
+              <w:t>int</w:t>
+            </w:r>
+          </w:p>
+        </w:tc>
+      </w:tr>
+    </w:tbl>
+    <w:p/>
+    <w:p/>
+    <w:p/>
+    <w:p/>
+    <w:p/>
+    <w:p/>
+    <w:p/>
+    <w:p/>
+    <w:p/>
+    <w:p>
+      <w:pPr>
+        <w:rPr>
+          <w:b/>
+          <w:sz w:val="40"/>
+        </w:rPr>
+      </w:pPr>
+      <w:r>
+        <w:rPr>
+          <w:b/>
+          <w:sz w:val="40"/>
+        </w:rPr>
+        <w:t>Funkcionālās prasības:</w:t>
+      </w:r>
+    </w:p>
+    <w:p>
+      <w:pPr>
+        <w:rPr>
+          <w:sz w:val="32"/>
+        </w:rPr>
+      </w:pPr>
+      <w:r>
+        <w:rPr>
+          <w:sz w:val="32"/>
+        </w:rPr>
+        <w:t>Lietotāju klases: viesis, reģistrēts lietotājs, administrators</w:t>
+      </w:r>
+    </w:p>
+    <w:p>
+      <w:pPr>
+        <w:rPr>
+          <w:sz w:val="32"/>
+        </w:rPr>
+      </w:pPr>
+      <w:r>
+        <w:rPr>
+          <w:sz w:val="32"/>
+        </w:rPr>
+        <w:t>Viesa iespējas:</w:t>
+      </w:r>
+    </w:p>
+    <w:p>
+      <w:pPr>
+        <w:rPr>
+          <w:sz w:val="32"/>
+        </w:rPr>
+      </w:pPr>
+      <w:r>
+        <w:rPr>
+          <w:sz w:val="32"/>
+        </w:rPr>
+        <w:tab/>
+        <w:t>Apskatīt spotus un spotu komentārus.</w:t>
+      </w:r>
+    </w:p>
+    <w:p>
+      <w:pPr>
+        <w:rPr>
+          <w:sz w:val="32"/>
+        </w:rPr>
+      </w:pPr>
+      <w:r>
+        <w:rPr>
+          <w:sz w:val="32"/>
+        </w:rPr>
+        <w:t>Lietotāja iespējas:</w:t>
+      </w:r>
+    </w:p>
+    <w:p>
+      <w:pPr>
+        <w:ind w:left="720"/>
+        <w:rPr>
+          <w:sz w:val="32"/>
+        </w:rPr>
+      </w:pPr>
+      <w:r>
+        <w:rPr>
+          <w:sz w:val="32"/>
+        </w:rPr>
+        <w:t>Registrēties sistēmā (lietotājvārds, e-pasts (caur google O-auth))</w:t>
+      </w:r>
+    </w:p>
+    <w:p>
+      <w:pPr>
+        <w:ind w:left="720"/>
+        <w:rPr>
+          <w:sz w:val="32"/>
+        </w:rPr>
+      </w:pPr>
+      <w:r>
+        <w:rPr>
+          <w:sz w:val="32"/>
+        </w:rPr>
+        <w:t>Pievienot attēlus savam spotam, un savam profilam</w:t>
+      </w:r>
+    </w:p>
+    <w:p>
+      <w:pPr>
+        <w:ind w:left="720"/>
+        <w:rPr>
+          <w:sz w:val="32"/>
+        </w:rPr>
+      </w:pPr>
+      <w:r>
+        <w:rPr>
+          <w:sz w:val="32"/>
+        </w:rPr>
+        <w:t xml:space="preserve">Pievienot, rediģēt un dzēst </w:t>
+      </w:r>
+      <w:r>
+        <w:rPr>
+          <w:sz w:val="32"/>
+        </w:rPr>
+        <w:t xml:space="preserve">savis </w:t>
+      </w:r>
+      <w:r>
+        <w:rPr>
+          <w:sz w:val="32"/>
+        </w:rPr>
+        <w:t>spotus.</w:t>
+      </w:r>
+    </w:p>
+    <w:p>
+      <w:pPr>
+        <w:ind w:left="720"/>
+        <w:rPr>
+          <w:sz w:val="32"/>
+        </w:rPr>
+      </w:pPr>
+      <w:r>
+        <w:rPr>
+          <w:sz w:val="32"/>
+        </w:rPr>
+        <w:t>Komentēt un rediģēt komentārus uz spotiem.</w:t>
+      </w:r>
+    </w:p>
+    <w:p>
+      <w:pPr>
+        <w:rPr>
+          <w:sz w:val="32"/>
+        </w:rPr>
+      </w:pPr>
+      <w:r>
+        <w:rPr>
+          <w:sz w:val="32"/>
+        </w:rPr>
+        <w:t>Administratora iespējas:</w:t>
+      </w:r>
+    </w:p>
+    <w:p>
+      <w:pPr>
+        <w:rPr>
+          <w:sz w:val="32"/>
+        </w:rPr>
+      </w:pPr>
+      <w:r>
+        <w:rPr>
+          <w:sz w:val="32"/>
+        </w:rPr>
+        <w:tab/>
+        <w:t>Dzēst/rediģēt jebkura lietotāja spotus.</w:t>
+      </w:r>
+    </w:p>
+    <w:p>
+      <w:pPr>
+        <w:rPr>
+          <w:sz w:val="32"/>
+        </w:rPr>
+      </w:pPr>
+      <w:r>
+        <w:rPr>
+          <w:sz w:val="32"/>
+        </w:rPr>
+        <w:tab/>
+        <w:t>Dzēst lietotājus ja nav paklausīgi.</w:t>
+      </w:r>
+    </w:p>
+    <w:p>
+      <w:pPr>
+        <w:rPr>
+          <w:sz w:val="32"/>
+        </w:rPr>
+      </w:pPr>
+    </w:p>
+    <w:p>
+      <w:pPr>
+        <w:rPr>
+          <w:sz w:val="32"/>
+        </w:rPr>
+      </w:pPr>
+    </w:p>
+    <w:p>
+      <w:pPr>
+        <w:rPr>
+          <w:sz w:val="32"/>
+        </w:rPr>
+      </w:pPr>
+    </w:p>
+    <w:p>
+      <w:pPr>
+        <w:rPr>
+          <w:sz w:val="32"/>
+        </w:rPr>
+      </w:pPr>
+    </w:p>
+    <w:p>
+      <w:pPr>
+        <w:rPr>
+          <w:sz w:val="32"/>
+        </w:rPr>
+      </w:pPr>
+    </w:p>
+    <w:p>
+      <w:pPr>
+        <w:rPr>
+          <w:sz w:val="32"/>
+        </w:rPr>
+      </w:pPr>
+    </w:p>
+    <w:p>
+      <w:pPr>
+        <w:rPr>
+          <w:sz w:val="32"/>
+        </w:rPr>
+      </w:pPr>
+    </w:p>
+    <w:p>
+      <w:pPr>
+        <w:rPr>
+          <w:sz w:val="32"/>
+        </w:rPr>
+      </w:pPr>
+    </w:p>
+    <w:p>
+      <w:pPr>
+        <w:rPr>
+          <w:sz w:val="32"/>
+        </w:rPr>
+      </w:pPr>
+    </w:p>
+    <w:p>
+      <w:pPr>
+        <w:rPr>
+          <w:sz w:val="32"/>
+        </w:rPr>
+      </w:pPr>
+      <w:bookmarkStart w:id="0" w:name="_GoBack"/>
+      <w:bookmarkEnd w:id="0"/>
+    </w:p>
+    <w:p>
+      <w:pPr>
+        <w:rPr>
+          <w:b/>
+          <w:sz w:val="40"/>
+        </w:rPr>
+      </w:pPr>
+      <w:r>
+        <w:rPr>
+          <w:b/>
+          <w:sz w:val="40"/>
+        </w:rPr>
+        <w:lastRenderedPageBreak/>
+        <w:t>Nefunkcionālās prasības:</w:t>
+      </w:r>
+    </w:p>
+    <w:p>
+      <w:pPr>
+        <w:pStyle w:val="ListParagraph"/>
+        <w:numPr>
+          <w:ilvl w:val="0"/>
+          <w:numId w:val="2"/>
+        </w:numPr>
+        <w:rPr>
+          <w:sz w:val="28"/>
+        </w:rPr>
+      </w:pPr>
+      <w:r>
+        <w:rPr>
+          <w:sz w:val="28"/>
+        </w:rPr>
+        <w:t>Prasības procesam</w:t>
+      </w:r>
+    </w:p>
+    <w:p>
+      <w:pPr>
+        <w:pStyle w:val="ListParagraph"/>
+        <w:numPr>
+          <w:ilvl w:val="0"/>
+          <w:numId w:val="3"/>
+        </w:numPr>
+        <w:rPr>
+          <w:sz w:val="28"/>
+        </w:rPr>
+      </w:pPr>
+      <w:r>
+        <w:rPr>
+          <w:sz w:val="28"/>
+        </w:rPr>
+        <w:t>Izstrādes valoda ReactJS, Python</w:t>
+      </w:r>
+    </w:p>
+    <w:p>
+      <w:pPr>
+        <w:pStyle w:val="ListParagraph"/>
+        <w:numPr>
+          <w:ilvl w:val="0"/>
+          <w:numId w:val="3"/>
+        </w:numPr>
+        <w:rPr>
+          <w:sz w:val="28"/>
+        </w:rPr>
+      </w:pPr>
+      <w:r>
+        <w:rPr>
+          <w:sz w:val="28"/>
+        </w:rPr>
+        <w:t>Datubāzes sistēma MySQL</w:t>
+      </w:r>
+    </w:p>
+    <w:p>
+      <w:pPr>
+        <w:pStyle w:val="ListParagraph"/>
+        <w:numPr>
+          <w:ilvl w:val="0"/>
+          <w:numId w:val="3"/>
+        </w:numPr>
+        <w:rPr>
+          <w:sz w:val="28"/>
+        </w:rPr>
+      </w:pPr>
+      <w:r>
+        <w:rPr>
+          <w:sz w:val="28"/>
+        </w:rPr>
+        <w:t>Sistēma jānodod līdz 01.02.2024</w:t>
+      </w:r>
+    </w:p>
+    <w:p>
+      <w:pPr>
+        <w:pStyle w:val="ListParagraph"/>
+        <w:numPr>
+          <w:ilvl w:val="0"/>
+          <w:numId w:val="3"/>
+        </w:numPr>
+        <w:rPr>
+          <w:sz w:val="28"/>
+        </w:rPr>
+      </w:pPr>
+      <w:r>
+        <w:rPr>
+          <w:sz w:val="28"/>
+        </w:rPr>
+        <w:t>Dokumentācija tiks noformēta adekvāti, saprotami visiem.</w:t>
+      </w:r>
+    </w:p>
+    <w:p>
+      <w:pPr>
+        <w:pStyle w:val="ListParagraph"/>
+        <w:numPr>
+          <w:ilvl w:val="0"/>
+          <w:numId w:val="2"/>
+        </w:numPr>
+        <w:rPr>
+          <w:sz w:val="28"/>
+        </w:rPr>
+      </w:pPr>
+      <w:r>
+        <w:rPr>
+          <w:sz w:val="28"/>
+        </w:rPr>
+        <w:t>Prasības produktam</w:t>
+      </w:r>
+    </w:p>
+    <w:p>
+      <w:pPr>
+        <w:pStyle w:val="ListParagraph"/>
+        <w:numPr>
+          <w:ilvl w:val="0"/>
+          <w:numId w:val="4"/>
+        </w:numPr>
+        <w:rPr>
+          <w:sz w:val="28"/>
+        </w:rPr>
+      </w:pPr>
+      <w:r>
+        <w:rPr>
+          <w:sz w:val="28"/>
+        </w:rPr>
+        <w:t>Lietotāja saskarnes valoda – angļu.</w:t>
+      </w:r>
+    </w:p>
+    <w:p>
+      <w:pPr>
+        <w:pStyle w:val="ListParagraph"/>
+        <w:numPr>
+          <w:ilvl w:val="0"/>
+          <w:numId w:val="4"/>
+        </w:numPr>
+        <w:rPr>
+          <w:sz w:val="28"/>
+        </w:rPr>
+      </w:pPr>
+      <w:r>
+        <w:rPr>
+          <w:sz w:val="28"/>
+        </w:rPr>
+        <w:t>Nepareizo darbību rezultātā, izvadīts ziņojums, vai tiek bloķēts.</w:t>
+      </w:r>
+    </w:p>
+    <w:p>
+      <w:pPr>
+        <w:pStyle w:val="ListParagraph"/>
+        <w:numPr>
+          <w:ilvl w:val="0"/>
+          <w:numId w:val="4"/>
+        </w:numPr>
+        <w:rPr>
+          <w:sz w:val="28"/>
+        </w:rPr>
+      </w:pPr>
+      <w:r>
+        <w:rPr>
+          <w:sz w:val="28"/>
+        </w:rPr>
+        <w:t xml:space="preserve">Reakcijas laiks uz vaicājumu nepārsniedz 5sekundes, pieņemot ka lietotāja interneta pieslēgums ir salīdzinoši normāls. </w:t>
+      </w:r>
+    </w:p>
+    <w:p>
+      <w:pPr>
+        <w:pStyle w:val="ListParagraph"/>
+        <w:numPr>
+          <w:ilvl w:val="0"/>
+          <w:numId w:val="4"/>
+        </w:numPr>
+        <w:rPr>
+          <w:sz w:val="28"/>
+        </w:rPr>
+      </w:pPr>
+      <w:r>
+        <w:rPr>
+          <w:sz w:val="28"/>
+        </w:rPr>
+        <w:t xml:space="preserve">Produkta un lietotāju drošību garantē </w:t>
+      </w:r>
+      <w:hyperlink r:id="rId9" w:history="1">
+        <w:r>
+          <w:rPr>
+            <w:sz w:val="28"/>
+          </w:rPr>
+          <w:t>OAuth 2.0</w:t>
+        </w:r>
+      </w:hyperlink>
+    </w:p>
+    <w:p>
+      <w:pPr>
+        <w:pStyle w:val="ListParagraph"/>
+        <w:numPr>
+          <w:ilvl w:val="0"/>
+          <w:numId w:val="4"/>
+        </w:numPr>
+        <w:rPr>
+          <w:sz w:val="28"/>
+        </w:rPr>
+      </w:pPr>
+      <w:r>
+        <w:rPr>
+          <w:sz w:val="28"/>
+        </w:rPr>
+        <w:t>Produkts būs lietojams gan uz datora, gan mobīlajām ierīcēm</w:t>
+      </w:r>
+    </w:p>
+    <w:p>
+      <w:pPr>
+        <w:rPr>
+          <w:sz w:val="28"/>
+        </w:rPr>
+      </w:pPr>
+    </w:p>
+    <w:p>
+      <w:pPr>
+        <w:ind w:left="720"/>
+        <w:rPr>
+          <w:sz w:val="28"/>
+        </w:rPr>
+      </w:pPr>
+      <w:r>
+        <w:rPr>
+          <w:sz w:val="28"/>
+        </w:rPr>
+        <w:t>3.Ārējās prasības</w:t>
+      </w:r>
+    </w:p>
+    <w:p>
+      <w:pPr>
+        <w:pStyle w:val="ListParagraph"/>
+        <w:numPr>
+          <w:ilvl w:val="0"/>
+          <w:numId w:val="5"/>
+        </w:numPr>
+        <w:rPr>
+          <w:sz w:val="28"/>
+        </w:rPr>
+      </w:pPr>
+      <w:r>
+        <w:rPr>
+          <w:sz w:val="28"/>
+        </w:rPr>
+        <w:t>Sistēma tik hostota uz atsevišķa datora, kurš mums jau ir pieejams un neradīs liekus traucējumus.</w:t>
+      </w:r>
+    </w:p>
     <w:sectPr>
       <w:pgSz w:w="11906" w:h="16838"/>
       <w:pgMar w:top="1440" w:right="1800" w:bottom="1440" w:left="1800" w:header="708" w:footer="708" w:gutter="0"/>
@@ -1112,9 +1518,261 @@
 </w:document>
 </file>
 
+<file path=word/endnotes.xml><?xml version="1.0" encoding="utf-8"?>
+<w:endnotes xmlns:wpc="http://schemas.microsoft.com/office/word/2010/wordprocessingCanvas" xmlns:cx="http://schemas.microsoft.com/office/drawing/2014/chartex" xmlns:mc="http://schemas.openxmlformats.org/markup-compatibility/2006" xmlns:o="urn:schemas-microsoft-com:office:office" xmlns:r="http://schemas.openxmlformats.org/officeDocument/2006/relationships" xmlns:m="http://schemas.openxmlformats.org/officeDocument/2006/math" xmlns:v="urn:schemas-microsoft-com:vml" xmlns:wp14="http://schemas.microsoft.com/office/word/2010/wordprocessingDrawing" xmlns:wp="http://schemas.openxmlformats.org/drawingml/2006/wordprocessingDrawing" xmlns:w10="urn:schemas-microsoft-com:office:word" xmlns:w="http://schemas.openxmlformats.org/wordprocessingml/2006/main" xmlns:w14="http://schemas.microsoft.com/office/word/2010/wordml" xmlns:w15="http://schemas.microsoft.com/office/word/2012/wordml" xmlns:w16se="http://schemas.microsoft.com/office/word/2015/wordml/symex" xmlns:wpg="http://schemas.microsoft.com/office/word/2010/wordprocessingGroup" xmlns:wpi="http://schemas.microsoft.com/office/word/2010/wordprocessingInk" xmlns:wne="http://schemas.microsoft.com/office/word/2006/wordml" xmlns:wps="http://schemas.microsoft.com/office/word/2010/wordprocessingShape" mc:Ignorable="w14 w15 w16se wp14">
+  <w:endnote w:type="separator" w:id="-1">
+    <w:p>
+      <w:pPr>
+        <w:spacing w:after="0" w:line="240" w:lineRule="auto"/>
+      </w:pPr>
+      <w:r>
+        <w:separator/>
+      </w:r>
+    </w:p>
+  </w:endnote>
+  <w:endnote w:type="continuationSeparator" w:id="0">
+    <w:p>
+      <w:pPr>
+        <w:spacing w:after="0" w:line="240" w:lineRule="auto"/>
+      </w:pPr>
+      <w:r>
+        <w:continuationSeparator/>
+      </w:r>
+    </w:p>
+  </w:endnote>
+</w:endnotes>
+</file>
+
+<file path=word/footnotes.xml><?xml version="1.0" encoding="utf-8"?>
+<w:footnotes xmlns:wpc="http://schemas.microsoft.com/office/word/2010/wordprocessingCanvas" xmlns:cx="http://schemas.microsoft.com/office/drawing/2014/chartex" xmlns:mc="http://schemas.openxmlformats.org/markup-compatibility/2006" xmlns:o="urn:schemas-microsoft-com:office:office" xmlns:r="http://schemas.openxmlformats.org/officeDocument/2006/relationships" xmlns:m="http://schemas.openxmlformats.org/officeDocument/2006/math" xmlns:v="urn:schemas-microsoft-com:vml" xmlns:wp14="http://schemas.microsoft.com/office/word/2010/wordprocessingDrawing" xmlns:wp="http://schemas.openxmlformats.org/drawingml/2006/wordprocessingDrawing" xmlns:w10="urn:schemas-microsoft-com:office:word" xmlns:w="http://schemas.openxmlformats.org/wordprocessingml/2006/main" xmlns:w14="http://schemas.microsoft.com/office/word/2010/wordml" xmlns:w15="http://schemas.microsoft.com/office/word/2012/wordml" xmlns:w16se="http://schemas.microsoft.com/office/word/2015/wordml/symex" xmlns:wpg="http://schemas.microsoft.com/office/word/2010/wordprocessingGroup" xmlns:wpi="http://schemas.microsoft.com/office/word/2010/wordprocessingInk" xmlns:wne="http://schemas.microsoft.com/office/word/2006/wordml" xmlns:wps="http://schemas.microsoft.com/office/word/2010/wordprocessingShape" mc:Ignorable="w14 w15 w16se wp14">
+  <w:footnote w:type="separator" w:id="-1">
+    <w:p>
+      <w:pPr>
+        <w:spacing w:after="0" w:line="240" w:lineRule="auto"/>
+      </w:pPr>
+      <w:r>
+        <w:separator/>
+      </w:r>
+    </w:p>
+  </w:footnote>
+  <w:footnote w:type="continuationSeparator" w:id="0">
+    <w:p>
+      <w:pPr>
+        <w:spacing w:after="0" w:line="240" w:lineRule="auto"/>
+      </w:pPr>
+      <w:r>
+        <w:continuationSeparator/>
+      </w:r>
+    </w:p>
+  </w:footnote>
+</w:footnotes>
+</file>
+
 <file path=word/numbering.xml><?xml version="1.0" encoding="utf-8"?>
-<w:numbering xmlns:wpc="http://schemas.microsoft.com/office/word/2010/wordprocessingCanvas" xmlns:cx="http://schemas.microsoft.com/office/drawing/2014/chartex" xmlns:cx1="http://schemas.microsoft.com/office/drawing/2015/9/8/chartex" xmlns:cx2="http://schemas.microsoft.com/office/drawing/2015/10/21/chartex" xmlns:cx3="http://schemas.microsoft.com/office/drawing/2016/5/9/chartex" xmlns:cx4="http://schemas.microsoft.com/office/drawing/2016/5/10/chartex" xmlns:cx5="http://schemas.microsoft.com/office/drawing/2016/5/11/chartex" xmlns:cx6="http://schemas.microsoft.com/office/drawing/2016/5/12/chartex" xmlns:cx7="http://schemas.microsoft.com/office/drawing/2016/5/13/chartex" xmlns:cx8="http://schemas.microsoft.com/office/drawing/2016/5/14/chartex" xmlns:mc="http://schemas.openxmlformats.org/markup-compatibility/2006" xmlns:aink="http://schemas.microsoft.com/office/drawing/2016/ink" xmlns:am3d="http://schemas.microsoft.com/office/drawing/2017/model3d" xmlns:o="urn:schemas-microsoft-com:office:office" xmlns:r="http://schemas.openxmlformats.org/officeDocument/2006/relationships" xmlns:m="http://schemas.openxmlformats.org/officeDocument/2006/math" xmlns:v="urn:schemas-microsoft-com:vml" xmlns:wp14="http://schemas.microsoft.com/office/word/2010/wordprocessingDrawing" xmlns:wp="http://schemas.openxmlformats.org/drawingml/2006/wordprocessingDrawing" xmlns:w10="urn:schemas-microsoft-com:office:word" xmlns:w="http://schemas.openxmlformats.org/wordprocessingml/2006/main" xmlns:w14="http://schemas.microsoft.com/office/word/2010/wordml" xmlns:w15="http://schemas.microsoft.com/office/word/2012/wordml" xmlns:w16cex="http://schemas.microsoft.com/office/word/2018/wordml/cex" xmlns:w16cid="http://schemas.microsoft.com/office/word/2016/wordml/cid" xmlns:w16="http://schemas.microsoft.com/office/word/2018/wordml" xmlns:w16sdtdh="http://schemas.microsoft.com/office/word/2020/wordml/sdtdatahash" xmlns:w16se="http://schemas.microsoft.com/office/word/2015/wordml/symex" xmlns:wpg="http://schemas.microsoft.com/office/word/2010/wordprocessingGroup" xmlns:wpi="http://schemas.microsoft.com/office/word/2010/wordprocessingInk" xmlns:wne="http://schemas.microsoft.com/office/word/2006/wordml" xmlns:wps="http://schemas.microsoft.com/office/word/2010/wordprocessingShape" mc:Ignorable="w14 w15 w16se w16cid w16 w16cex w16sdtdh wp14">
+<w:numbering xmlns:wpc="http://schemas.microsoft.com/office/word/2010/wordprocessingCanvas" xmlns:cx="http://schemas.microsoft.com/office/drawing/2014/chartex" xmlns:mc="http://schemas.openxmlformats.org/markup-compatibility/2006" xmlns:o="urn:schemas-microsoft-com:office:office" xmlns:r="http://schemas.openxmlformats.org/officeDocument/2006/relationships" xmlns:m="http://schemas.openxmlformats.org/officeDocument/2006/math" xmlns:v="urn:schemas-microsoft-com:vml" xmlns:wp14="http://schemas.microsoft.com/office/word/2010/wordprocessingDrawing" xmlns:wp="http://schemas.openxmlformats.org/drawingml/2006/wordprocessingDrawing" xmlns:w10="urn:schemas-microsoft-com:office:word" xmlns:w="http://schemas.openxmlformats.org/wordprocessingml/2006/main" xmlns:w14="http://schemas.microsoft.com/office/word/2010/wordml" xmlns:w15="http://schemas.microsoft.com/office/word/2012/wordml" xmlns:w16se="http://schemas.microsoft.com/office/word/2015/wordml/symex" xmlns:wpg="http://schemas.microsoft.com/office/word/2010/wordprocessingGroup" xmlns:wpi="http://schemas.microsoft.com/office/word/2010/wordprocessingInk" xmlns:wne="http://schemas.microsoft.com/office/word/2006/wordml" xmlns:wps="http://schemas.microsoft.com/office/word/2010/wordprocessingShape" mc:Ignorable="w14 w15 w16se wp14">
   <w:abstractNum w:abstractNumId="0" w15:restartNumberingAfterBreak="0">
+    <w:nsid w:val="2BF5051F"/>
+    <w:multiLevelType w:val="hybridMultilevel"/>
+    <w:tmpl w:val="5E80F078"/>
+    <w:lvl w:ilvl="0" w:tplc="04260001">
+      <w:start w:val="1"/>
+      <w:numFmt w:val="bullet"/>
+      <w:lvlText w:val=""/>
+      <w:lvlJc w:val="left"/>
+      <w:pPr>
+        <w:ind w:left="1800" w:hanging="360"/>
+      </w:pPr>
+      <w:rPr>
+        <w:rFonts w:ascii="Symbol" w:hAnsi="Symbol" w:hint="default"/>
+      </w:rPr>
+    </w:lvl>
+    <w:lvl w:ilvl="1" w:tplc="04260003" w:tentative="1">
+      <w:start w:val="1"/>
+      <w:numFmt w:val="bullet"/>
+      <w:lvlText w:val="o"/>
+      <w:lvlJc w:val="left"/>
+      <w:pPr>
+        <w:ind w:left="2520" w:hanging="360"/>
+      </w:pPr>
+      <w:rPr>
+        <w:rFonts w:ascii="Courier New" w:hAnsi="Courier New" w:cs="Courier New" w:hint="default"/>
+      </w:rPr>
+    </w:lvl>
+    <w:lvl w:ilvl="2" w:tplc="04260005" w:tentative="1">
+      <w:start w:val="1"/>
+      <w:numFmt w:val="bullet"/>
+      <w:lvlText w:val=""/>
+      <w:lvlJc w:val="left"/>
+      <w:pPr>
+        <w:ind w:left="3240" w:hanging="360"/>
+      </w:pPr>
+      <w:rPr>
+        <w:rFonts w:ascii="Wingdings" w:hAnsi="Wingdings" w:hint="default"/>
+      </w:rPr>
+    </w:lvl>
+    <w:lvl w:ilvl="3" w:tplc="04260001" w:tentative="1">
+      <w:start w:val="1"/>
+      <w:numFmt w:val="bullet"/>
+      <w:lvlText w:val=""/>
+      <w:lvlJc w:val="left"/>
+      <w:pPr>
+        <w:ind w:left="3960" w:hanging="360"/>
+      </w:pPr>
+      <w:rPr>
+        <w:rFonts w:ascii="Symbol" w:hAnsi="Symbol" w:hint="default"/>
+      </w:rPr>
+    </w:lvl>
+    <w:lvl w:ilvl="4" w:tplc="04260003" w:tentative="1">
+      <w:start w:val="1"/>
+      <w:numFmt w:val="bullet"/>
+      <w:lvlText w:val="o"/>
+      <w:lvlJc w:val="left"/>
+      <w:pPr>
+        <w:ind w:left="4680" w:hanging="360"/>
+      </w:pPr>
+      <w:rPr>
+        <w:rFonts w:ascii="Courier New" w:hAnsi="Courier New" w:cs="Courier New" w:hint="default"/>
+      </w:rPr>
+    </w:lvl>
+    <w:lvl w:ilvl="5" w:tplc="04260005" w:tentative="1">
+      <w:start w:val="1"/>
+      <w:numFmt w:val="bullet"/>
+      <w:lvlText w:val=""/>
+      <w:lvlJc w:val="left"/>
+      <w:pPr>
+        <w:ind w:left="5400" w:hanging="360"/>
+      </w:pPr>
+      <w:rPr>
+        <w:rFonts w:ascii="Wingdings" w:hAnsi="Wingdings" w:hint="default"/>
+      </w:rPr>
+    </w:lvl>
+    <w:lvl w:ilvl="6" w:tplc="04260001" w:tentative="1">
+      <w:start w:val="1"/>
+      <w:numFmt w:val="bullet"/>
+      <w:lvlText w:val=""/>
+      <w:lvlJc w:val="left"/>
+      <w:pPr>
+        <w:ind w:left="6120" w:hanging="360"/>
+      </w:pPr>
+      <w:rPr>
+        <w:rFonts w:ascii="Symbol" w:hAnsi="Symbol" w:hint="default"/>
+      </w:rPr>
+    </w:lvl>
+    <w:lvl w:ilvl="7" w:tplc="04260003" w:tentative="1">
+      <w:start w:val="1"/>
+      <w:numFmt w:val="bullet"/>
+      <w:lvlText w:val="o"/>
+      <w:lvlJc w:val="left"/>
+      <w:pPr>
+        <w:ind w:left="6840" w:hanging="360"/>
+      </w:pPr>
+      <w:rPr>
+        <w:rFonts w:ascii="Courier New" w:hAnsi="Courier New" w:cs="Courier New" w:hint="default"/>
+      </w:rPr>
+    </w:lvl>
+    <w:lvl w:ilvl="8" w:tplc="04260005" w:tentative="1">
+      <w:start w:val="1"/>
+      <w:numFmt w:val="bullet"/>
+      <w:lvlText w:val=""/>
+      <w:lvlJc w:val="left"/>
+      <w:pPr>
+        <w:ind w:left="7560" w:hanging="360"/>
+      </w:pPr>
+      <w:rPr>
+        <w:rFonts w:ascii="Wingdings" w:hAnsi="Wingdings" w:hint="default"/>
+      </w:rPr>
+    </w:lvl>
+  </w:abstractNum>
+  <w:abstractNum w:abstractNumId="1" w15:restartNumberingAfterBreak="0">
+    <w:nsid w:val="420740AD"/>
+    <w:multiLevelType w:val="hybridMultilevel"/>
+    <w:tmpl w:val="D076E77E"/>
+    <w:lvl w:ilvl="0" w:tplc="83C21696">
+      <w:start w:val="1"/>
+      <w:numFmt w:val="decimal"/>
+      <w:lvlText w:val="%1."/>
+      <w:lvlJc w:val="left"/>
+      <w:pPr>
+        <w:ind w:left="1080" w:hanging="360"/>
+      </w:pPr>
+      <w:rPr>
+        <w:rFonts w:hint="default"/>
+      </w:rPr>
+    </w:lvl>
+    <w:lvl w:ilvl="1" w:tplc="04260019" w:tentative="1">
+      <w:start w:val="1"/>
+      <w:numFmt w:val="lowerLetter"/>
+      <w:lvlText w:val="%2."/>
+      <w:lvlJc w:val="left"/>
+      <w:pPr>
+        <w:ind w:left="1800" w:hanging="360"/>
+      </w:pPr>
+    </w:lvl>
+    <w:lvl w:ilvl="2" w:tplc="0426001B" w:tentative="1">
+      <w:start w:val="1"/>
+      <w:numFmt w:val="lowerRoman"/>
+      <w:lvlText w:val="%3."/>
+      <w:lvlJc w:val="right"/>
+      <w:pPr>
+        <w:ind w:left="2520" w:hanging="180"/>
+      </w:pPr>
+    </w:lvl>
+    <w:lvl w:ilvl="3" w:tplc="0426000F" w:tentative="1">
+      <w:start w:val="1"/>
+      <w:numFmt w:val="decimal"/>
+      <w:lvlText w:val="%4."/>
+      <w:lvlJc w:val="left"/>
+      <w:pPr>
+        <w:ind w:left="3240" w:hanging="360"/>
+      </w:pPr>
+    </w:lvl>
+    <w:lvl w:ilvl="4" w:tplc="04260019" w:tentative="1">
+      <w:start w:val="1"/>
+      <w:numFmt w:val="lowerLetter"/>
+      <w:lvlText w:val="%5."/>
+      <w:lvlJc w:val="left"/>
+      <w:pPr>
+        <w:ind w:left="3960" w:hanging="360"/>
+      </w:pPr>
+    </w:lvl>
+    <w:lvl w:ilvl="5" w:tplc="0426001B" w:tentative="1">
+      <w:start w:val="1"/>
+      <w:numFmt w:val="lowerRoman"/>
+      <w:lvlText w:val="%6."/>
+      <w:lvlJc w:val="right"/>
+      <w:pPr>
+        <w:ind w:left="4680" w:hanging="180"/>
+      </w:pPr>
+    </w:lvl>
+    <w:lvl w:ilvl="6" w:tplc="0426000F" w:tentative="1">
+      <w:start w:val="1"/>
+      <w:numFmt w:val="decimal"/>
+      <w:lvlText w:val="%7."/>
+      <w:lvlJc w:val="left"/>
+      <w:pPr>
+        <w:ind w:left="5400" w:hanging="360"/>
+      </w:pPr>
+    </w:lvl>
+    <w:lvl w:ilvl="7" w:tplc="04260019" w:tentative="1">
+      <w:start w:val="1"/>
+      <w:numFmt w:val="lowerLetter"/>
+      <w:lvlText w:val="%8."/>
+      <w:lvlJc w:val="left"/>
+      <w:pPr>
+        <w:ind w:left="6120" w:hanging="360"/>
+      </w:pPr>
+    </w:lvl>
+    <w:lvl w:ilvl="8" w:tplc="0426001B" w:tentative="1">
+      <w:start w:val="1"/>
+      <w:numFmt w:val="lowerRoman"/>
+      <w:lvlText w:val="%9."/>
+      <w:lvlJc w:val="right"/>
+      <w:pPr>
+        <w:ind w:left="6840" w:hanging="180"/>
+      </w:pPr>
+    </w:lvl>
+  </w:abstractNum>
+  <w:abstractNum w:abstractNumId="2" w15:restartNumberingAfterBreak="0">
     <w:nsid w:val="694727E3"/>
     <w:multiLevelType w:val="hybridMultilevel"/>
     <w:tmpl w:val="CCF8C84C"/>
@@ -1200,14 +1858,252 @@
       </w:pPr>
     </w:lvl>
   </w:abstractNum>
+  <w:abstractNum w:abstractNumId="3" w15:restartNumberingAfterBreak="0">
+    <w:nsid w:val="6A614CDE"/>
+    <w:multiLevelType w:val="hybridMultilevel"/>
+    <w:tmpl w:val="5E820666"/>
+    <w:lvl w:ilvl="0" w:tplc="04260001">
+      <w:start w:val="1"/>
+      <w:numFmt w:val="bullet"/>
+      <w:lvlText w:val=""/>
+      <w:lvlJc w:val="left"/>
+      <w:pPr>
+        <w:ind w:left="2160" w:hanging="360"/>
+      </w:pPr>
+      <w:rPr>
+        <w:rFonts w:ascii="Symbol" w:hAnsi="Symbol" w:hint="default"/>
+      </w:rPr>
+    </w:lvl>
+    <w:lvl w:ilvl="1" w:tplc="04260003" w:tentative="1">
+      <w:start w:val="1"/>
+      <w:numFmt w:val="bullet"/>
+      <w:lvlText w:val="o"/>
+      <w:lvlJc w:val="left"/>
+      <w:pPr>
+        <w:ind w:left="2880" w:hanging="360"/>
+      </w:pPr>
+      <w:rPr>
+        <w:rFonts w:ascii="Courier New" w:hAnsi="Courier New" w:cs="Courier New" w:hint="default"/>
+      </w:rPr>
+    </w:lvl>
+    <w:lvl w:ilvl="2" w:tplc="04260005" w:tentative="1">
+      <w:start w:val="1"/>
+      <w:numFmt w:val="bullet"/>
+      <w:lvlText w:val=""/>
+      <w:lvlJc w:val="left"/>
+      <w:pPr>
+        <w:ind w:left="3600" w:hanging="360"/>
+      </w:pPr>
+      <w:rPr>
+        <w:rFonts w:ascii="Wingdings" w:hAnsi="Wingdings" w:hint="default"/>
+      </w:rPr>
+    </w:lvl>
+    <w:lvl w:ilvl="3" w:tplc="04260001" w:tentative="1">
+      <w:start w:val="1"/>
+      <w:numFmt w:val="bullet"/>
+      <w:lvlText w:val=""/>
+      <w:lvlJc w:val="left"/>
+      <w:pPr>
+        <w:ind w:left="4320" w:hanging="360"/>
+      </w:pPr>
+      <w:rPr>
+        <w:rFonts w:ascii="Symbol" w:hAnsi="Symbol" w:hint="default"/>
+      </w:rPr>
+    </w:lvl>
+    <w:lvl w:ilvl="4" w:tplc="04260003" w:tentative="1">
+      <w:start w:val="1"/>
+      <w:numFmt w:val="bullet"/>
+      <w:lvlText w:val="o"/>
+      <w:lvlJc w:val="left"/>
+      <w:pPr>
+        <w:ind w:left="5040" w:hanging="360"/>
+      </w:pPr>
+      <w:rPr>
+        <w:rFonts w:ascii="Courier New" w:hAnsi="Courier New" w:cs="Courier New" w:hint="default"/>
+      </w:rPr>
+    </w:lvl>
+    <w:lvl w:ilvl="5" w:tplc="04260005" w:tentative="1">
+      <w:start w:val="1"/>
+      <w:numFmt w:val="bullet"/>
+      <w:lvlText w:val=""/>
+      <w:lvlJc w:val="left"/>
+      <w:pPr>
+        <w:ind w:left="5760" w:hanging="360"/>
+      </w:pPr>
+      <w:rPr>
+        <w:rFonts w:ascii="Wingdings" w:hAnsi="Wingdings" w:hint="default"/>
+      </w:rPr>
+    </w:lvl>
+    <w:lvl w:ilvl="6" w:tplc="04260001" w:tentative="1">
+      <w:start w:val="1"/>
+      <w:numFmt w:val="bullet"/>
+      <w:lvlText w:val=""/>
+      <w:lvlJc w:val="left"/>
+      <w:pPr>
+        <w:ind w:left="6480" w:hanging="360"/>
+      </w:pPr>
+      <w:rPr>
+        <w:rFonts w:ascii="Symbol" w:hAnsi="Symbol" w:hint="default"/>
+      </w:rPr>
+    </w:lvl>
+    <w:lvl w:ilvl="7" w:tplc="04260003" w:tentative="1">
+      <w:start w:val="1"/>
+      <w:numFmt w:val="bullet"/>
+      <w:lvlText w:val="o"/>
+      <w:lvlJc w:val="left"/>
+      <w:pPr>
+        <w:ind w:left="7200" w:hanging="360"/>
+      </w:pPr>
+      <w:rPr>
+        <w:rFonts w:ascii="Courier New" w:hAnsi="Courier New" w:cs="Courier New" w:hint="default"/>
+      </w:rPr>
+    </w:lvl>
+    <w:lvl w:ilvl="8" w:tplc="04260005" w:tentative="1">
+      <w:start w:val="1"/>
+      <w:numFmt w:val="bullet"/>
+      <w:lvlText w:val=""/>
+      <w:lvlJc w:val="left"/>
+      <w:pPr>
+        <w:ind w:left="7920" w:hanging="360"/>
+      </w:pPr>
+      <w:rPr>
+        <w:rFonts w:ascii="Wingdings" w:hAnsi="Wingdings" w:hint="default"/>
+      </w:rPr>
+    </w:lvl>
+  </w:abstractNum>
+  <w:abstractNum w:abstractNumId="4" w15:restartNumberingAfterBreak="0">
+    <w:nsid w:val="73583846"/>
+    <w:multiLevelType w:val="hybridMultilevel"/>
+    <w:tmpl w:val="2174A840"/>
+    <w:lvl w:ilvl="0" w:tplc="04260001">
+      <w:start w:val="1"/>
+      <w:numFmt w:val="bullet"/>
+      <w:lvlText w:val=""/>
+      <w:lvlJc w:val="left"/>
+      <w:pPr>
+        <w:ind w:left="1800" w:hanging="360"/>
+      </w:pPr>
+      <w:rPr>
+        <w:rFonts w:ascii="Symbol" w:hAnsi="Symbol" w:hint="default"/>
+      </w:rPr>
+    </w:lvl>
+    <w:lvl w:ilvl="1" w:tplc="04260003" w:tentative="1">
+      <w:start w:val="1"/>
+      <w:numFmt w:val="bullet"/>
+      <w:lvlText w:val="o"/>
+      <w:lvlJc w:val="left"/>
+      <w:pPr>
+        <w:ind w:left="2520" w:hanging="360"/>
+      </w:pPr>
+      <w:rPr>
+        <w:rFonts w:ascii="Courier New" w:hAnsi="Courier New" w:cs="Courier New" w:hint="default"/>
+      </w:rPr>
+    </w:lvl>
+    <w:lvl w:ilvl="2" w:tplc="04260005" w:tentative="1">
+      <w:start w:val="1"/>
+      <w:numFmt w:val="bullet"/>
+      <w:lvlText w:val=""/>
+      <w:lvlJc w:val="left"/>
+      <w:pPr>
+        <w:ind w:left="3240" w:hanging="360"/>
+      </w:pPr>
+      <w:rPr>
+        <w:rFonts w:ascii="Wingdings" w:hAnsi="Wingdings" w:hint="default"/>
+      </w:rPr>
+    </w:lvl>
+    <w:lvl w:ilvl="3" w:tplc="04260001" w:tentative="1">
+      <w:start w:val="1"/>
+      <w:numFmt w:val="bullet"/>
+      <w:lvlText w:val=""/>
+      <w:lvlJc w:val="left"/>
+      <w:pPr>
+        <w:ind w:left="3960" w:hanging="360"/>
+      </w:pPr>
+      <w:rPr>
+        <w:rFonts w:ascii="Symbol" w:hAnsi="Symbol" w:hint="default"/>
+      </w:rPr>
+    </w:lvl>
+    <w:lvl w:ilvl="4" w:tplc="04260003" w:tentative="1">
+      <w:start w:val="1"/>
+      <w:numFmt w:val="bullet"/>
+      <w:lvlText w:val="o"/>
+      <w:lvlJc w:val="left"/>
+      <w:pPr>
+        <w:ind w:left="4680" w:hanging="360"/>
+      </w:pPr>
+      <w:rPr>
+        <w:rFonts w:ascii="Courier New" w:hAnsi="Courier New" w:cs="Courier New" w:hint="default"/>
+      </w:rPr>
+    </w:lvl>
+    <w:lvl w:ilvl="5" w:tplc="04260005" w:tentative="1">
+      <w:start w:val="1"/>
+      <w:numFmt w:val="bullet"/>
+      <w:lvlText w:val=""/>
+      <w:lvlJc w:val="left"/>
+      <w:pPr>
+        <w:ind w:left="5400" w:hanging="360"/>
+      </w:pPr>
+      <w:rPr>
+        <w:rFonts w:ascii="Wingdings" w:hAnsi="Wingdings" w:hint="default"/>
+      </w:rPr>
+    </w:lvl>
+    <w:lvl w:ilvl="6" w:tplc="04260001" w:tentative="1">
+      <w:start w:val="1"/>
+      <w:numFmt w:val="bullet"/>
+      <w:lvlText w:val=""/>
+      <w:lvlJc w:val="left"/>
+      <w:pPr>
+        <w:ind w:left="6120" w:hanging="360"/>
+      </w:pPr>
+      <w:rPr>
+        <w:rFonts w:ascii="Symbol" w:hAnsi="Symbol" w:hint="default"/>
+      </w:rPr>
+    </w:lvl>
+    <w:lvl w:ilvl="7" w:tplc="04260003" w:tentative="1">
+      <w:start w:val="1"/>
+      <w:numFmt w:val="bullet"/>
+      <w:lvlText w:val="o"/>
+      <w:lvlJc w:val="left"/>
+      <w:pPr>
+        <w:ind w:left="6840" w:hanging="360"/>
+      </w:pPr>
+      <w:rPr>
+        <w:rFonts w:ascii="Courier New" w:hAnsi="Courier New" w:cs="Courier New" w:hint="default"/>
+      </w:rPr>
+    </w:lvl>
+    <w:lvl w:ilvl="8" w:tplc="04260005" w:tentative="1">
+      <w:start w:val="1"/>
+      <w:numFmt w:val="bullet"/>
+      <w:lvlText w:val=""/>
+      <w:lvlJc w:val="left"/>
+      <w:pPr>
+        <w:ind w:left="7560" w:hanging="360"/>
+      </w:pPr>
+      <w:rPr>
+        <w:rFonts w:ascii="Wingdings" w:hAnsi="Wingdings" w:hint="default"/>
+      </w:rPr>
+    </w:lvl>
+  </w:abstractNum>
   <w:num w:numId="1">
+    <w:abstractNumId w:val="2"/>
+  </w:num>
+  <w:num w:numId="2">
+    <w:abstractNumId w:val="1"/>
+  </w:num>
+  <w:num w:numId="3">
     <w:abstractNumId w:val="0"/>
+  </w:num>
+  <w:num w:numId="4">
+    <w:abstractNumId w:val="4"/>
+  </w:num>
+  <w:num w:numId="5">
+    <w:abstractNumId w:val="3"/>
   </w:num>
 </w:numbering>
 </file>
 
 <file path=word/styles.xml><?xml version="1.0" encoding="utf-8"?>
-<w:styles xmlns:mc="http://schemas.openxmlformats.org/markup-compatibility/2006" xmlns:r="http://schemas.openxmlformats.org/officeDocument/2006/relationships" xmlns:w="http://schemas.openxmlformats.org/wordprocessingml/2006/main" xmlns:w14="http://schemas.microsoft.com/office/word/2010/wordml" xmlns:w15="http://schemas.microsoft.com/office/word/2012/wordml" xmlns:w16cex="http://schemas.microsoft.com/office/word/2018/wordml/cex" xmlns:w16cid="http://schemas.microsoft.com/office/word/2016/wordml/cid" xmlns:w16="http://schemas.microsoft.com/office/word/2018/wordml" xmlns:w16sdtdh="http://schemas.microsoft.com/office/word/2020/wordml/sdtdatahash" xmlns:w16se="http://schemas.microsoft.com/office/word/2015/wordml/symex" mc:Ignorable="w14 w15 w16se w16cid w16 w16cex w16sdtdh">
+<w:styles xmlns:mc="http://schemas.openxmlformats.org/markup-compatibility/2006" xmlns:r="http://schemas.openxmlformats.org/officeDocument/2006/relationships" xmlns:w="http://schemas.openxmlformats.org/wordprocessingml/2006/main" xmlns:w14="http://schemas.microsoft.com/office/word/2010/wordml" xmlns:w15="http://schemas.microsoft.com/office/word/2012/wordml" xmlns:w16se="http://schemas.microsoft.com/office/word/2015/wordml/symex" mc:Ignorable="w14 w15 w16se">
   <w:docDefaults>
     <w:rPrDefault>
       <w:rPr>
@@ -1223,7 +2119,7 @@
       </w:pPr>
     </w:pPrDefault>
   </w:docDefaults>
-  <w:latentStyles w:defLockedState="0" w:defUIPriority="99" w:defSemiHidden="0" w:defUnhideWhenUsed="0" w:defQFormat="0" w:count="376">
+  <w:latentStyles w:defLockedState="0" w:defUIPriority="99" w:defSemiHidden="0" w:defUnhideWhenUsed="0" w:defQFormat="0" w:count="371">
     <w:lsdException w:name="Normal" w:uiPriority="0" w:qFormat="1"/>
     <w:lsdException w:name="heading 1" w:uiPriority="9" w:qFormat="1"/>
     <w:lsdException w:name="heading 2" w:semiHidden="1" w:uiPriority="9" w:unhideWhenUsed="1" w:qFormat="1"/>
@@ -1595,15 +2491,30 @@
     <w:lsdException w:name="List Table 5 Dark Accent 6" w:uiPriority="50"/>
     <w:lsdException w:name="List Table 6 Colorful Accent 6" w:uiPriority="51"/>
     <w:lsdException w:name="List Table 7 Colorful Accent 6" w:uiPriority="52"/>
-    <w:lsdException w:name="Mention" w:semiHidden="1" w:unhideWhenUsed="1"/>
-    <w:lsdException w:name="Smart Hyperlink" w:semiHidden="1" w:unhideWhenUsed="1"/>
-    <w:lsdException w:name="Hashtag" w:semiHidden="1" w:unhideWhenUsed="1"/>
-    <w:lsdException w:name="Unresolved Mention" w:semiHidden="1" w:unhideWhenUsed="1"/>
-    <w:lsdException w:name="Smart Link" w:semiHidden="1" w:unhideWhenUsed="1"/>
   </w:latentStyles>
   <w:style w:type="paragraph" w:default="1" w:styleId="Normal">
     <w:name w:val="Normal"/>
     <w:qFormat/>
+  </w:style>
+  <w:style w:type="paragraph" w:styleId="Heading3">
+    <w:name w:val="heading 3"/>
+    <w:basedOn w:val="Normal"/>
+    <w:link w:val="Heading3Char"/>
+    <w:uiPriority w:val="9"/>
+    <w:qFormat/>
+    <w:rsid w:val="00EB4264"/>
+    <w:pPr>
+      <w:spacing w:before="100" w:beforeAutospacing="1" w:after="100" w:afterAutospacing="1" w:line="240" w:lineRule="auto"/>
+      <w:outlineLvl w:val="2"/>
+    </w:pPr>
+    <w:rPr>
+      <w:rFonts w:ascii="Times New Roman" w:eastAsia="Times New Roman" w:hAnsi="Times New Roman" w:cs="Times New Roman"/>
+      <w:b/>
+      <w:bCs/>
+      <w:sz w:val="27"/>
+      <w:szCs w:val="27"/>
+      <w:lang w:eastAsia="lv-LV"/>
+    </w:rPr>
   </w:style>
   <w:style w:type="character" w:default="1" w:styleId="DefaultParagraphFont">
     <w:name w:val="Default Paragraph Font"/>
@@ -1661,6 +2572,72 @@
         <w:insideV w:val="single" w:sz="4" w:space="0" w:color="auto"/>
       </w:tblBorders>
     </w:tblPr>
+  </w:style>
+  <w:style w:type="paragraph" w:styleId="EndnoteText">
+    <w:name w:val="endnote text"/>
+    <w:basedOn w:val="Normal"/>
+    <w:link w:val="EndnoteTextChar"/>
+    <w:uiPriority w:val="99"/>
+    <w:semiHidden/>
+    <w:unhideWhenUsed/>
+    <w:rsid w:val="00EB4264"/>
+    <w:pPr>
+      <w:spacing w:after="0" w:line="240" w:lineRule="auto"/>
+    </w:pPr>
+    <w:rPr>
+      <w:sz w:val="20"/>
+      <w:szCs w:val="20"/>
+    </w:rPr>
+  </w:style>
+  <w:style w:type="character" w:customStyle="1" w:styleId="EndnoteTextChar">
+    <w:name w:val="Endnote Text Char"/>
+    <w:basedOn w:val="DefaultParagraphFont"/>
+    <w:link w:val="EndnoteText"/>
+    <w:uiPriority w:val="99"/>
+    <w:semiHidden/>
+    <w:rsid w:val="00EB4264"/>
+    <w:rPr>
+      <w:sz w:val="20"/>
+      <w:szCs w:val="20"/>
+    </w:rPr>
+  </w:style>
+  <w:style w:type="character" w:styleId="EndnoteReference">
+    <w:name w:val="endnote reference"/>
+    <w:basedOn w:val="DefaultParagraphFont"/>
+    <w:uiPriority w:val="99"/>
+    <w:semiHidden/>
+    <w:unhideWhenUsed/>
+    <w:rsid w:val="00EB4264"/>
+    <w:rPr>
+      <w:vertAlign w:val="superscript"/>
+    </w:rPr>
+  </w:style>
+  <w:style w:type="character" w:customStyle="1" w:styleId="Heading3Char">
+    <w:name w:val="Heading 3 Char"/>
+    <w:basedOn w:val="DefaultParagraphFont"/>
+    <w:link w:val="Heading3"/>
+    <w:uiPriority w:val="9"/>
+    <w:rsid w:val="00EB4264"/>
+    <w:rPr>
+      <w:rFonts w:ascii="Times New Roman" w:eastAsia="Times New Roman" w:hAnsi="Times New Roman" w:cs="Times New Roman"/>
+      <w:b/>
+      <w:bCs/>
+      <w:sz w:val="27"/>
+      <w:szCs w:val="27"/>
+      <w:lang w:eastAsia="lv-LV"/>
+    </w:rPr>
+  </w:style>
+  <w:style w:type="character" w:styleId="Hyperlink">
+    <w:name w:val="Hyperlink"/>
+    <w:basedOn w:val="DefaultParagraphFont"/>
+    <w:uiPriority w:val="99"/>
+    <w:semiHidden/>
+    <w:unhideWhenUsed/>
+    <w:rsid w:val="00EB4264"/>
+    <w:rPr>
+      <w:color w:val="0000FF"/>
+      <w:u w:val="single"/>
+    </w:rPr>
   </w:style>
 </w:styles>
 </file>
@@ -1958,4 +2935,16 @@
     </a:ext>
   </a:extLst>
 </a:theme>
+</file>
+
+<file path=customXml/item1.xml><?xml version="1.0" encoding="utf-8"?>
+<b:Sources xmlns:b="http://schemas.openxmlformats.org/officeDocument/2006/bibliography" xmlns="http://schemas.openxmlformats.org/officeDocument/2006/bibliography" SelectedStyle="\APASixthEditionOfficeOnline.xsl" StyleName="APA" Version="6"/>
+</file>
+
+<file path=customXml/itemProps1.xml><?xml version="1.0" encoding="utf-8"?>
+<ds:datastoreItem xmlns:ds="http://schemas.openxmlformats.org/officeDocument/2006/customXml" ds:itemID="{CC262454-12C3-404A-893F-FFEA031430FE}">
+  <ds:schemaRefs>
+    <ds:schemaRef ds:uri="http://schemas.openxmlformats.org/officeDocument/2006/bibliography"/>
+  </ds:schemaRefs>
+</ds:datastoreItem>
 </file>
</xml_diff>